<commit_message>
Simplify the Week 08 State Machines lab
Co-Authored-By: Claude Opus 5.5 <noreply@anthropic.com>
Claude-Session: https://claude.ai/code/session_016jtnPXZmxWKhq11ysF7ez7
</commit_message>
<xml_diff>
--- a/W08/W08 LAB State Machines and the LCD Display.docx
+++ b/W08/W08 LAB State Machines and the LCD Display.docx
@@ -1423,6 +1423,111 @@
         <w:t xml:space="preserve"> for 2 s, and repeats.</w:t>
       </w:r>
     </w:p>
+    <w:tbl>
+      <w:tblPr>
+        <w:tblW w:w="9706" w:type="dxa"/>
+        <w:tblLayout w:type="fixed"/>
+        <w:tblLook w:val="04A0" w:firstRow="1" w:lastRow="0" w:firstColumn="1" w:lastColumn="0" w:noHBand="0" w:noVBand="1"/>
+      </w:tblPr>
+      <w:tblGrid>
+        <w:gridCol w:w="9706"/>
+      </w:tblGrid>
+      <w:tr>
+        <w:trPr>
+          <w:cantSplit/>
+        </w:trPr>
+        <w:tc>
+          <w:tcPr>
+            <w:tcW w:w="9706" w:type="dxa"/>
+            <w:tcMar>
+              <w:top w:w="60" w:type="dxa"/>
+              <w:left w:w="100" w:type="dxa"/>
+              <w:bottom w:w="60" w:type="dxa"/>
+              <w:right w:w="100" w:type="dxa"/>
+            </w:tcMar>
+            <w:vAlign w:val="bottom"/>
+          </w:tcPr>
+          <w:p>
+            <w:pPr>
+              <w:spacing w:after="40" w:line="264" w:lineRule="auto"/>
+              <w:jc w:val="center"/>
+            </w:pPr>
+            <w:r>
+              <w:rPr>
+                <w:noProof/>
+              </w:rPr>
+              <w:drawing>
+                <wp:inline distT="0" distB="0" distL="0" distR="0">
+                  <wp:extent cx="4622250" cy="4299051"/>
+                  <wp:effectExtent l="0" t="0" r="0" b="0"/>
+                  <wp:docPr id="504" name="Figure 4"/>
+                  <wp:cNvGraphicFramePr>
+                    <a:graphicFrameLocks xmlns:a="http://schemas.openxmlformats.org/drawingml/2006/main" noChangeAspect="1"/>
+                  </wp:cNvGraphicFramePr>
+                  <a:graphic xmlns:a="http://schemas.openxmlformats.org/drawingml/2006/main">
+                    <a:graphicData uri="http://schemas.openxmlformats.org/drawingml/2006/picture">
+                      <pic:pic xmlns:pic="http://schemas.openxmlformats.org/drawingml/2006/picture">
+                        <pic:nvPicPr>
+                          <pic:cNvPr id="504" name="fig03_wokwi_task1.png"/>
+                          <pic:cNvPicPr/>
+                        </pic:nvPicPr>
+                        <pic:blipFill>
+                          <a:blip r:embed="rIdImg4"/>
+                          <a:stretch>
+                            <a:fillRect/>
+                          </a:stretch>
+                        </pic:blipFill>
+                        <pic:spPr>
+                          <a:xfrm>
+                            <a:off x="0" y="0"/>
+                            <a:ext cx="4622250" cy="4299051"/>
+                          </a:xfrm>
+                          <a:prstGeom prst="rect">
+                            <a:avLst/>
+                          </a:prstGeom>
+                        </pic:spPr>
+                      </pic:pic>
+                    </a:graphicData>
+                  </a:graphic>
+                </wp:inline>
+              </w:drawing>
+            </w:r>
+          </w:p>
+          <w:p>
+            <w:pPr>
+              <w:spacing w:line="264" w:lineRule="auto"/>
+              <w:jc w:val="center"/>
+            </w:pPr>
+            <w:r>
+              <w:rPr>
+                <w:b/>
+                <w:bCs/>
+                <w:color w:val="595959"/>
+                <w:sz w:val="18"/>
+                <w:szCs w:val="18"/>
+              </w:rPr>
+              <w:t xml:space="preserve">Figure 4: </w:t>
+            </w:r>
+            <w:r>
+              <w:rPr>
+                <w:color w:val="595959"/>
+                <w:sz w:val="18"/>
+                <w:szCs w:val="18"/>
+              </w:rPr>
+              <w:t xml:space="preserve">Task 1 running in the Wokwi simulator, with the Serial Monitor underneath</w:t>
+            </w:r>
+          </w:p>
+        </w:tc>
+      </w:tr>
+    </w:tbl>
+    <w:p>
+      <w:pPr>
+        <w:spacing w:after="84"/>
+        <w:rPr>
+          <w:sz w:val="8"/>
+        </w:rPr>
+      </w:pPr>
+    </w:p>
     <w:p>
       <w:pPr>
         <w:pStyle w:val="Heading2"/>
@@ -1966,35 +2071,7 @@
       </w:pPr>
       <w:r>
         <w:rPr/>
-        <w:t xml:space="preserve">Make YELLOW last 3 seconds instead of 2. Which line did you change? Why is it better to keep the times in named constants such as </w:t>
-      </w:r>
-      <w:r>
-        <w:rPr>
-          <w:rFonts w:ascii="Consolas" w:hAnsi="Consolas" w:cs="Consolas"/>
-          <w:color w:val="C7254E"/>
-          <w:sz w:val="20"/>
-          <w:szCs w:val="20"/>
-          <w:shd w:val="clear" w:color="auto" w:fill="F4F4F4"/>
-        </w:rPr>
-        <w:t xml:space="preserve">YELLOW_TIME</w:t>
-      </w:r>
-      <w:r>
-        <w:rPr/>
-        <w:t xml:space="preserve"> than to type </w:t>
-      </w:r>
-      <w:r>
-        <w:rPr>
-          <w:rFonts w:ascii="Consolas" w:hAnsi="Consolas" w:cs="Consolas"/>
-          <w:color w:val="C7254E"/>
-          <w:sz w:val="20"/>
-          <w:szCs w:val="20"/>
-          <w:shd w:val="clear" w:color="auto" w:fill="F4F4F4"/>
-        </w:rPr>
-        <w:t xml:space="preserve">delay(2000)</w:t>
-      </w:r>
-      <w:r>
-        <w:rPr/>
-        <w:t xml:space="preserve"> inside the case?</w:t>
+        <w:t xml:space="preserve">Make YELLOW last 3 seconds instead of 2. Which line did you change? How long is one full cycle now?</w:t>
       </w:r>
     </w:p>
     <w:tbl>
@@ -2040,11 +2117,6 @@
               </w:rPr>
               <w:t>Your answer:</w:t>
             </w:r>
-          </w:p>
-          <w:p>
-            <w:pPr>
-              <w:spacing w:after="200" w:line="264" w:lineRule="auto"/>
-            </w:pPr>
           </w:p>
           <w:p>
             <w:pPr>
@@ -2919,7 +2991,7 @@
                 <wp:inline distT="0" distB="0" distL="0" distR="0">
                   <wp:extent cx="4437360" cy="5026696"/>
                   <wp:effectExtent l="0" t="0" r="0" b="0"/>
-                  <wp:docPr id="504" name="Figure 4"/>
+                  <wp:docPr id="505" name="Figure 5"/>
                   <wp:cNvGraphicFramePr>
                     <a:graphicFrameLocks xmlns:a="http://schemas.openxmlformats.org/drawingml/2006/main" noChangeAspect="1"/>
                   </wp:cNvGraphicFramePr>
@@ -2927,11 +2999,11 @@
                     <a:graphicData uri="http://schemas.openxmlformats.org/drawingml/2006/picture">
                       <pic:pic xmlns:pic="http://schemas.openxmlformats.org/drawingml/2006/picture">
                         <pic:nvPicPr>
-                          <pic:cNvPr id="504" name="fig04_task2_wiring.png"/>
+                          <pic:cNvPr id="505" name="fig04_task2_wiring.png"/>
                           <pic:cNvPicPr/>
                         </pic:nvPicPr>
                         <pic:blipFill>
-                          <a:blip r:embed="rIdImg4"/>
+                          <a:blip r:embed="rIdImg5"/>
                           <a:stretch>
                             <a:fillRect/>
                           </a:stretch>
@@ -2965,7 +3037,7 @@
                 <w:sz w:val="18"/>
                 <w:szCs w:val="18"/>
               </w:rPr>
-              <w:t xml:space="preserve">Figure 4: </w:t>
+              <w:t xml:space="preserve">Figure 5: </w:t>
             </w:r>
             <w:r>
               <w:rPr>
@@ -3024,7 +3096,7 @@
                 <wp:inline distT="0" distB="0" distL="0" distR="0">
                   <wp:extent cx="4930400" cy="1931073"/>
                   <wp:effectExtent l="0" t="0" r="0" b="0"/>
-                  <wp:docPr id="505" name="Figure 5"/>
+                  <wp:docPr id="506" name="Figure 6"/>
                   <wp:cNvGraphicFramePr>
                     <a:graphicFrameLocks xmlns:a="http://schemas.openxmlformats.org/drawingml/2006/main" noChangeAspect="1"/>
                   </wp:cNvGraphicFramePr>
@@ -3032,11 +3104,11 @@
                     <a:graphicData uri="http://schemas.openxmlformats.org/drawingml/2006/picture">
                       <pic:pic xmlns:pic="http://schemas.openxmlformats.org/drawingml/2006/picture">
                         <pic:nvPicPr>
-                          <pic:cNvPr id="505" name="fig05_task2_timing.png"/>
+                          <pic:cNvPr id="506" name="fig05_task2_timing.png"/>
                           <pic:cNvPicPr/>
                         </pic:nvPicPr>
                         <pic:blipFill>
-                          <a:blip r:embed="rIdImg5"/>
+                          <a:blip r:embed="rIdImg6"/>
                           <a:stretch>
                             <a:fillRect/>
                           </a:stretch>
@@ -3070,7 +3142,7 @@
                 <w:sz w:val="18"/>
                 <w:szCs w:val="18"/>
               </w:rPr>
-              <w:t xml:space="preserve">Figure 5: </w:t>
+              <w:t xml:space="preserve">Figure 6: </w:t>
             </w:r>
             <w:r>
               <w:rPr>
@@ -3211,35 +3283,7 @@
       </w:r>
       <w:r>
         <w:rPr/>
-        <w:t xml:space="preserve"> one LED at a time, in step with the LCD (</w:t>
-      </w:r>
-      <w:r>
-        <w:rPr>
-          <w:rFonts w:ascii="Consolas" w:hAnsi="Consolas" w:cs="Consolas"/>
-          <w:color w:val="C7254E"/>
-          <w:sz w:val="20"/>
-          <w:szCs w:val="20"/>
-          <w:shd w:val="clear" w:color="auto" w:fill="F4F4F4"/>
-        </w:rPr>
-        <w:t xml:space="preserve">State: RED</w:t>
-      </w:r>
-      <w:r>
-        <w:rPr/>
-        <w:t xml:space="preserve"> / </w:t>
-      </w:r>
-      <w:r>
-        <w:rPr>
-          <w:rFonts w:ascii="Consolas" w:hAnsi="Consolas" w:cs="Consolas"/>
-          <w:color w:val="C7254E"/>
-          <w:sz w:val="20"/>
-          <w:szCs w:val="20"/>
-          <w:shd w:val="clear" w:color="auto" w:fill="F4F4F4"/>
-        </w:rPr>
-        <w:t xml:space="preserve">STOP</w:t>
-      </w:r>
-      <w:r>
-        <w:rPr/>
-        <w:t xml:space="preserve">, and so on).</w:t>
+        <w:t xml:space="preserve"> one LED at a time, in step with the LCD.</w:t>
       </w:r>
     </w:p>
     <w:p>
@@ -3345,7 +3389,7 @@
                 <w:sz w:val="17"/>
                 <w:szCs w:val="17"/>
               </w:rPr>
-              <w:t xml:space="preserve">Traffic light ready</w:t>
+              <w:t xml:space="preserve">State: RED</w:t>
             </w:r>
           </w:p>
           <w:p>
@@ -3359,7 +3403,7 @@
                 <w:sz w:val="17"/>
                 <w:szCs w:val="17"/>
               </w:rPr>
-              <w:t xml:space="preserve">State 0: RED</w:t>
+              <w:t xml:space="preserve">State: GREEN</w:t>
             </w:r>
           </w:p>
           <w:p>
@@ -3373,21 +3417,7 @@
                 <w:sz w:val="17"/>
                 <w:szCs w:val="17"/>
               </w:rPr>
-              <w:t xml:space="preserve">State 1: GREEN</w:t>
-            </w:r>
-          </w:p>
-          <w:p>
-            <w:pPr>
-              <w:spacing w:after="0"/>
-            </w:pPr>
-            <w:r>
-              <w:rPr>
-                <w:rFonts w:ascii="Consolas" w:hAnsi="Consolas" w:cs="Consolas"/>
-                <w:color w:val="1F1F1F"/>
-                <w:sz w:val="17"/>
-                <w:szCs w:val="17"/>
-              </w:rPr>
-              <w:t xml:space="preserve">State 2: YELLOW</w:t>
+              <w:t xml:space="preserve">State: YELLOW</w:t>
             </w:r>
           </w:p>
         </w:tc>
@@ -3421,7 +3451,7 @@
       </w:pPr>
       <w:r>
         <w:rPr/>
-        <w:t xml:space="preserve">In each case, replace the </w:t>
+        <w:t xml:space="preserve">In every case, delete the two lines that switch the other LEDs </w:t>
       </w:r>
       <w:r>
         <w:rPr>
@@ -3431,39 +3461,11 @@
           <w:szCs w:val="20"/>
           <w:shd w:val="clear" w:color="auto" w:fill="F4F4F4"/>
         </w:rPr>
-        <w:t xml:space="preserve">setLights(…)</w:t>
+        <w:t xml:space="preserve">LOW</w:t>
       </w:r>
       <w:r>
         <w:rPr/>
-        <w:t xml:space="preserve"> line with a single </w:t>
-      </w:r>
-      <w:r>
-        <w:rPr>
-          <w:rFonts w:ascii="Consolas" w:hAnsi="Consolas" w:cs="Consolas"/>
-          <w:color w:val="C7254E"/>
-          <w:sz w:val="20"/>
-          <w:szCs w:val="20"/>
-          <w:shd w:val="clear" w:color="auto" w:fill="F4F4F4"/>
-        </w:rPr>
-        <w:t xml:space="preserve">digitalWrite(…, HIGH)</w:t>
-      </w:r>
-      <w:r>
-        <w:rPr/>
-        <w:t xml:space="preserve"> for that state’s LED. Run it for two cycles. What do the LEDs show, and why? Compare with Figure 5. Then put </w:t>
-      </w:r>
-      <w:r>
-        <w:rPr>
-          <w:rFonts w:ascii="Consolas" w:hAnsi="Consolas" w:cs="Consolas"/>
-          <w:color w:val="C7254E"/>
-          <w:sz w:val="20"/>
-          <w:szCs w:val="20"/>
-          <w:shd w:val="clear" w:color="auto" w:fill="F4F4F4"/>
-        </w:rPr>
-        <w:t xml:space="preserve">setLights()</w:t>
-      </w:r>
-      <w:r>
-        <w:rPr/>
-        <w:t xml:space="preserve"> back.</w:t>
+        <w:t xml:space="preserve">. Run it for two cycles. What do the LEDs show, and why? Compare with Figure 6. Then put the lines back.</w:t>
       </w:r>
     </w:p>
     <w:tbl>
@@ -3547,7 +3549,7 @@
           <w:b/>
           <w:bCs/>
         </w:rPr>
-        <w:t xml:space="preserve">2c  The numbers behind the names</w:t>
+        <w:t xml:space="preserve">2c  The resistor</w:t>
       </w:r>
     </w:p>
     <w:p>
@@ -3556,21 +3558,7 @@
       </w:pPr>
       <w:r>
         <w:rPr/>
-        <w:t xml:space="preserve">What would the LCD show if you changed the enum to </w:t>
-      </w:r>
-      <w:r>
-        <w:rPr>
-          <w:rFonts w:ascii="Consolas" w:hAnsi="Consolas" w:cs="Consolas"/>
-          <w:color w:val="C7254E"/>
-          <w:sz w:val="20"/>
-          <w:szCs w:val="20"/>
-          <w:shd w:val="clear" w:color="auto" w:fill="F4F4F4"/>
-        </w:rPr>
-        <w:t xml:space="preserve">{ RED, YELLOW, GREEN }</w:t>
-      </w:r>
-      <w:r>
-        <w:rPr/>
-        <w:t xml:space="preserve"> but left the two text arrays as they are? Why?</w:t>
+        <w:t xml:space="preserve">A red LED drops about 2 V and the pin gives 5 V. Roughly how much current flows through the 220 Ω resistor?</w:t>
       </w:r>
     </w:p>
     <w:tbl>
@@ -3627,99 +3615,6 @@
               <w:spacing w:after="200" w:line="264" w:lineRule="auto"/>
             </w:pPr>
           </w:p>
-          <w:p>
-            <w:pPr>
-              <w:spacing w:after="200" w:line="264" w:lineRule="auto"/>
-            </w:pPr>
-          </w:p>
-        </w:tc>
-      </w:tr>
-    </w:tbl>
-    <w:p>
-      <w:pPr>
-        <w:spacing w:after="84"/>
-        <w:rPr>
-          <w:sz w:val="8"/>
-        </w:rPr>
-      </w:pPr>
-    </w:p>
-    <w:p>
-      <w:pPr>
-        <w:pStyle w:val="Heading3"/>
-        <w:keepNext/>
-        <w:spacing w:before="180" w:after="60"/>
-      </w:pPr>
-      <w:r>
-        <w:rPr>
-          <w:b/>
-          <w:bCs/>
-        </w:rPr>
-        <w:t xml:space="preserve">2d  The resistor</w:t>
-      </w:r>
-    </w:p>
-    <w:p>
-      <w:pPr>
-        <w:spacing w:after="120" w:line="264" w:lineRule="auto"/>
-      </w:pPr>
-      <w:r>
-        <w:rPr/>
-        <w:t xml:space="preserve">A red LED drops about 2 V and the pin gives 5 V. Roughly how much current flows through the 220 Ω resistor?</w:t>
-      </w:r>
-    </w:p>
-    <w:tbl>
-      <w:tblPr>
-        <w:tblW w:w="9706" w:type="dxa"/>
-        <w:tblBorders>
-          <w:top w:val="single" w:sz="4" w:space="0" w:color="A6A6A6"/>
-          <w:left w:val="single" w:sz="4" w:space="0" w:color="A6A6A6"/>
-          <w:bottom w:val="single" w:sz="4" w:space="0" w:color="A6A6A6"/>
-          <w:right w:val="single" w:sz="4" w:space="0" w:color="A6A6A6"/>
-        </w:tblBorders>
-        <w:tblLayout w:type="fixed"/>
-        <w:tblLook w:val="04A0" w:firstRow="1" w:lastRow="0" w:firstColumn="1" w:lastColumn="0" w:noHBand="0" w:noVBand="1"/>
-      </w:tblPr>
-      <w:tblGrid>
-        <w:gridCol w:w="9706"/>
-      </w:tblGrid>
-      <w:tr>
-        <w:trPr>
-          <w:cantSplit/>
-        </w:trPr>
-        <w:tc>
-          <w:tcPr>
-            <w:tcW w:w="9706" w:type="dxa"/>
-            <w:tcMar>
-              <w:top w:w="60" w:type="dxa"/>
-              <w:left w:w="120" w:type="dxa"/>
-              <w:bottom w:w="60" w:type="dxa"/>
-              <w:right w:w="120" w:type="dxa"/>
-            </w:tcMar>
-          </w:tcPr>
-          <w:p>
-            <w:pPr>
-              <w:spacing w:line="264" w:lineRule="auto"/>
-            </w:pPr>
-            <w:r>
-              <w:rPr>
-                <w:i/>
-                <w:iCs/>
-                <w:color w:val="7F7F7F"/>
-                <w:sz w:val="18"/>
-                <w:szCs w:val="18"/>
-              </w:rPr>
-              <w:t>Your answer:</w:t>
-            </w:r>
-          </w:p>
-          <w:p>
-            <w:pPr>
-              <w:spacing w:after="200" w:line="264" w:lineRule="auto"/>
-            </w:pPr>
-          </w:p>
-          <w:p>
-            <w:pPr>
-              <w:spacing w:after="200" w:line="264" w:lineRule="auto"/>
-            </w:pPr>
-          </w:p>
         </w:tc>
       </w:tr>
     </w:tbl>
@@ -3758,46 +3653,18 @@
       </w:r>
       <w:r>
         <w:rPr/>
-        <w:t xml:space="preserve"> the cars’ light stays GREEN until the button is pressed and released, then goes YELLOW → WALK (countdown) → CLEAR → GREEN. The sketch uses </w:t>
-      </w:r>
-      <w:r>
-        <w:rPr>
-          <w:rFonts w:ascii="Consolas" w:hAnsi="Consolas" w:cs="Consolas"/>
-          <w:color w:val="C7254E"/>
-          <w:sz w:val="20"/>
-          <w:szCs w:val="20"/>
-          <w:shd w:val="clear" w:color="auto" w:fill="F4F4F4"/>
-        </w:rPr>
-        <w:t xml:space="preserve">millis()</w:t>
-      </w:r>
-      <w:r>
-        <w:rPr/>
-        <w:t xml:space="preserve"> instead of </w:t>
-      </w:r>
-      <w:r>
-        <w:rPr>
-          <w:rFonts w:ascii="Consolas" w:hAnsi="Consolas" w:cs="Consolas"/>
-          <w:color w:val="C7254E"/>
-          <w:sz w:val="20"/>
-          <w:szCs w:val="20"/>
-          <w:shd w:val="clear" w:color="auto" w:fill="F4F4F4"/>
-        </w:rPr>
-        <w:t xml:space="preserve">delay()</w:t>
-      </w:r>
-      <w:r>
-        <w:rPr/>
-        <w:t xml:space="preserve">, and the button is debounced and reacts on the </w:t>
+        <w:t xml:space="preserve"> make a transition happen because of an </w:t>
       </w:r>
       <w:r>
         <w:rPr>
           <w:b/>
           <w:bCs/>
         </w:rPr>
-        <w:t xml:space="preserve">rising edge</w:t>
+        <w:t xml:space="preserve">input</w:t>
       </w:r>
       <w:r>
         <w:rPr/>
-        <w:t xml:space="preserve"> (when it is released).</w:t>
+        <w:t xml:space="preserve">. The light now stays GREEN until a pedestrian presses the button, then goes YELLOW → RED as before.</w:t>
       </w:r>
     </w:p>
     <w:p>
@@ -4207,7 +4074,7 @@
                 <wp:inline distT="0" distB="0" distL="0" distR="0">
                   <wp:extent cx="4437360" cy="5165364"/>
                   <wp:effectExtent l="0" t="0" r="0" b="0"/>
-                  <wp:docPr id="506" name="Figure 6"/>
+                  <wp:docPr id="507" name="Figure 7"/>
                   <wp:cNvGraphicFramePr>
                     <a:graphicFrameLocks xmlns:a="http://schemas.openxmlformats.org/drawingml/2006/main" noChangeAspect="1"/>
                   </wp:cNvGraphicFramePr>
@@ -4215,11 +4082,11 @@
                     <a:graphicData uri="http://schemas.openxmlformats.org/drawingml/2006/picture">
                       <pic:pic xmlns:pic="http://schemas.openxmlformats.org/drawingml/2006/picture">
                         <pic:nvPicPr>
-                          <pic:cNvPr id="506" name="fig06_task3_wiring.png"/>
+                          <pic:cNvPr id="507" name="fig06_task3_wiring.png"/>
                           <pic:cNvPicPr/>
                         </pic:nvPicPr>
                         <pic:blipFill>
-                          <a:blip r:embed="rIdImg6"/>
+                          <a:blip r:embed="rIdImg7"/>
                           <a:stretch>
                             <a:fillRect/>
                           </a:stretch>
@@ -4253,7 +4120,7 @@
                 <w:sz w:val="18"/>
                 <w:szCs w:val="18"/>
               </w:rPr>
-              <w:t xml:space="preserve">Figure 6: </w:t>
+              <w:t xml:space="preserve">Figure 7: </w:t>
             </w:r>
             <w:r>
               <w:rPr>
@@ -4310,9 +4177,9 @@
               </w:rPr>
               <w:drawing>
                 <wp:inline distT="0" distB="0" distL="0" distR="0">
-                  <wp:extent cx="4930400" cy="2876066"/>
+                  <wp:extent cx="4622250" cy="2773350"/>
                   <wp:effectExtent l="0" t="0" r="0" b="0"/>
-                  <wp:docPr id="507" name="Figure 7"/>
+                  <wp:docPr id="508" name="Figure 8"/>
                   <wp:cNvGraphicFramePr>
                     <a:graphicFrameLocks xmlns:a="http://schemas.openxmlformats.org/drawingml/2006/main" noChangeAspect="1"/>
                   </wp:cNvGraphicFramePr>
@@ -4320,11 +4187,11 @@
                     <a:graphicData uri="http://schemas.openxmlformats.org/drawingml/2006/picture">
                       <pic:pic xmlns:pic="http://schemas.openxmlformats.org/drawingml/2006/picture">
                         <pic:nvPicPr>
-                          <pic:cNvPr id="507" name="fig08_fsm_crossing.png"/>
+                          <pic:cNvPr id="508" name="fig08_fsm_crossing.png"/>
                           <pic:cNvPicPr/>
                         </pic:nvPicPr>
                         <pic:blipFill>
-                          <a:blip r:embed="rIdImg7"/>
+                          <a:blip r:embed="rIdImg8"/>
                           <a:stretch>
                             <a:fillRect/>
                           </a:stretch>
@@ -4332,7 +4199,7 @@
                         <pic:spPr>
                           <a:xfrm>
                             <a:off x="0" y="0"/>
-                            <a:ext cx="4930400" cy="2876066"/>
+                            <a:ext cx="4622250" cy="2773350"/>
                           </a:xfrm>
                           <a:prstGeom prst="rect">
                             <a:avLst/>
@@ -4358,7 +4225,7 @@
                 <w:sz w:val="18"/>
                 <w:szCs w:val="18"/>
               </w:rPr>
-              <w:t xml:space="preserve">Figure 7: </w:t>
+              <w:t xml:space="preserve">Figure 8: </w:t>
             </w:r>
             <w:r>
               <w:rPr>
@@ -4499,7 +4366,7 @@
       </w:r>
       <w:r>
         <w:rPr/>
-        <w:t xml:space="preserve"> the light stays GREEN until you press and release the button; the LCD shows </w:t>
+        <w:t xml:space="preserve"> RED for 5 s, then GREEN with </w:t>
       </w:r>
       <w:r>
         <w:rPr>
@@ -4509,25 +4376,11 @@
           <w:szCs w:val="20"/>
           <w:shd w:val="clear" w:color="auto" w:fill="F4F4F4"/>
         </w:rPr>
-        <w:t xml:space="preserve">WAIT...</w:t>
+        <w:t xml:space="preserve">Press button</w:t>
       </w:r>
       <w:r>
         <w:rPr/>
-        <w:t xml:space="preserve">, then a </w:t>
-      </w:r>
-      <w:r>
-        <w:rPr>
-          <w:rFonts w:ascii="Consolas" w:hAnsi="Consolas" w:cs="Consolas"/>
-          <w:color w:val="C7254E"/>
-          <w:sz w:val="20"/>
-          <w:szCs w:val="20"/>
-          <w:shd w:val="clear" w:color="auto" w:fill="F4F4F4"/>
-        </w:rPr>
-        <w:t xml:space="preserve">WALK 6s … 1s</w:t>
-      </w:r>
-      <w:r>
-        <w:rPr/>
-        <w:t xml:space="preserve"> countdown.</w:t>
+        <w:t xml:space="preserve"> on the LCD until you press the button, then YELLOW for 2 s and back to RED.</w:t>
       </w:r>
     </w:p>
     <w:p>
@@ -4563,10 +4416,6 @@
         <w:spacing w:after="120" w:line="264" w:lineRule="auto"/>
       </w:pPr>
       <w:r>
-        <w:rPr/>
-        <w:t xml:space="preserve">Press the button. </w:t>
-      </w:r>
-      <w:r>
         <w:rPr>
           <w:b/>
           <w:bCs/>
@@ -4575,7 +4424,7 @@
       </w:r>
       <w:r>
         <w:rPr/>
-        <w:t xml:space="preserve"> Paste the Serial Monitor output for one crossing. It should look like this:</w:t>
+        <w:t xml:space="preserve"> Paste the Serial Monitor output for one cycle. It should look like this:</w:t>
       </w:r>
     </w:p>
     <w:p>
@@ -4637,7 +4486,7 @@
                 <w:sz w:val="17"/>
                 <w:szCs w:val="17"/>
               </w:rPr>
-              <w:t xml:space="preserve">Crossing ready</w:t>
+              <w:t xml:space="preserve">State: RED</w:t>
             </w:r>
           </w:p>
           <w:p>
@@ -4651,7 +4500,7 @@
                 <w:sz w:val="17"/>
                 <w:szCs w:val="17"/>
               </w:rPr>
-              <w:t xml:space="preserve">-&gt; GREEN</w:t>
+              <w:t xml:space="preserve">State: GREEN</w:t>
             </w:r>
           </w:p>
           <w:p>
@@ -4665,7 +4514,7 @@
                 <w:sz w:val="17"/>
                 <w:szCs w:val="17"/>
               </w:rPr>
-              <w:t xml:space="preserve">Button released</w:t>
+              <w:t xml:space="preserve">Button pressed</w:t>
             </w:r>
           </w:p>
           <w:p>
@@ -4679,49 +4528,7 @@
                 <w:sz w:val="17"/>
                 <w:szCs w:val="17"/>
               </w:rPr>
-              <w:t xml:space="preserve">-&gt; YELLOW</w:t>
-            </w:r>
-          </w:p>
-          <w:p>
-            <w:pPr>
-              <w:spacing w:after="0"/>
-            </w:pPr>
-            <w:r>
-              <w:rPr>
-                <w:rFonts w:ascii="Consolas" w:hAnsi="Consolas" w:cs="Consolas"/>
-                <w:color w:val="1F1F1F"/>
-                <w:sz w:val="17"/>
-                <w:szCs w:val="17"/>
-              </w:rPr>
-              <w:t xml:space="preserve">-&gt; WALK</w:t>
-            </w:r>
-          </w:p>
-          <w:p>
-            <w:pPr>
-              <w:spacing w:after="0"/>
-            </w:pPr>
-            <w:r>
-              <w:rPr>
-                <w:rFonts w:ascii="Consolas" w:hAnsi="Consolas" w:cs="Consolas"/>
-                <w:color w:val="1F1F1F"/>
-                <w:sz w:val="17"/>
-                <w:szCs w:val="17"/>
-              </w:rPr>
-              <w:t xml:space="preserve">-&gt; CLEAR</w:t>
-            </w:r>
-          </w:p>
-          <w:p>
-            <w:pPr>
-              <w:spacing w:after="0"/>
-            </w:pPr>
-            <w:r>
-              <w:rPr>
-                <w:rFonts w:ascii="Consolas" w:hAnsi="Consolas" w:cs="Consolas"/>
-                <w:color w:val="1F1F1F"/>
-                <w:sz w:val="17"/>
-                <w:szCs w:val="17"/>
-              </w:rPr>
-              <w:t xml:space="preserve">-&gt; GREEN</w:t>
+              <w:t xml:space="preserve">State: YELLOW</w:t>
             </w:r>
           </w:p>
         </w:tc>
@@ -4755,409 +4562,7 @@
       </w:pPr>
       <w:r>
         <w:rPr/>
-        <w:t xml:space="preserve">Press and release the button at each of the times below. Use the state diagram to explain each result.</w:t>
-      </w:r>
-    </w:p>
-    <w:tbl>
-      <w:tblPr>
-        <w:tblW w:w="9706" w:type="dxa"/>
-        <w:tblBorders>
-          <w:top w:val="single" w:sz="4" w:space="0" w:color="BFBFBF"/>
-          <w:left w:val="single" w:sz="4" w:space="0" w:color="BFBFBF"/>
-          <w:bottom w:val="single" w:sz="4" w:space="0" w:color="BFBFBF"/>
-          <w:right w:val="single" w:sz="4" w:space="0" w:color="BFBFBF"/>
-          <w:insideH w:val="single" w:sz="4" w:space="0" w:color="BFBFBF"/>
-          <w:insideV w:val="single" w:sz="4" w:space="0" w:color="BFBFBF"/>
-        </w:tblBorders>
-        <w:tblLayout w:type="fixed"/>
-        <w:tblLook w:val="04A0" w:firstRow="1" w:lastRow="0" w:firstColumn="1" w:lastColumn="0" w:noHBand="0" w:noVBand="1"/>
-      </w:tblPr>
-      <w:tblGrid>
-        <w:gridCol w:w="3200"/>
-        <w:gridCol w:w="3200"/>
-        <w:gridCol w:w="3306"/>
-      </w:tblGrid>
-      <w:tr>
-        <w:trPr>
-          <w:cantSplit/>
-          <w:tblHeader/>
-        </w:trPr>
-        <w:tc>
-          <w:tcPr>
-            <w:tcW w:w="3200" w:type="dxa"/>
-            <w:shd w:val="clear" w:color="auto" w:fill="2E74B5"/>
-            <w:tcMar>
-              <w:top w:w="60" w:type="dxa"/>
-              <w:left w:w="100" w:type="dxa"/>
-              <w:bottom w:w="60" w:type="dxa"/>
-              <w:right w:w="100" w:type="dxa"/>
-            </w:tcMar>
-          </w:tcPr>
-          <w:p>
-            <w:pPr>
-              <w:spacing w:line="264" w:lineRule="auto"/>
-            </w:pPr>
-            <w:r>
-              <w:rPr>
-                <w:b/>
-                <w:bCs/>
-                <w:color w:val="FFFFFF"/>
-                <w:sz w:val="19"/>
-                <w:szCs w:val="19"/>
-              </w:rPr>
-              <w:t xml:space="preserve">When you press and release</w:t>
-            </w:r>
-          </w:p>
-        </w:tc>
-        <w:tc>
-          <w:tcPr>
-            <w:tcW w:w="3200" w:type="dxa"/>
-            <w:shd w:val="clear" w:color="auto" w:fill="2E74B5"/>
-            <w:tcMar>
-              <w:top w:w="60" w:type="dxa"/>
-              <w:left w:w="100" w:type="dxa"/>
-              <w:bottom w:w="60" w:type="dxa"/>
-              <w:right w:w="100" w:type="dxa"/>
-            </w:tcMar>
-          </w:tcPr>
-          <w:p>
-            <w:pPr>
-              <w:spacing w:line="264" w:lineRule="auto"/>
-            </w:pPr>
-            <w:r>
-              <w:rPr>
-                <w:b/>
-                <w:bCs/>
-                <w:color w:val="FFFFFF"/>
-                <w:sz w:val="19"/>
-                <w:szCs w:val="19"/>
-              </w:rPr>
-              <w:t xml:space="preserve">What happens</w:t>
-            </w:r>
-          </w:p>
-        </w:tc>
-        <w:tc>
-          <w:tcPr>
-            <w:tcW w:w="3306" w:type="dxa"/>
-            <w:shd w:val="clear" w:color="auto" w:fill="2E74B5"/>
-            <w:tcMar>
-              <w:top w:w="60" w:type="dxa"/>
-              <w:left w:w="100" w:type="dxa"/>
-              <w:bottom w:w="60" w:type="dxa"/>
-              <w:right w:w="100" w:type="dxa"/>
-            </w:tcMar>
-          </w:tcPr>
-          <w:p>
-            <w:pPr>
-              <w:spacing w:line="264" w:lineRule="auto"/>
-            </w:pPr>
-            <w:r>
-              <w:rPr>
-                <w:b/>
-                <w:bCs/>
-                <w:color w:val="FFFFFF"/>
-                <w:sz w:val="19"/>
-                <w:szCs w:val="19"/>
-              </w:rPr>
-              <w:t xml:space="preserve">Why</w:t>
-            </w:r>
-          </w:p>
-        </w:tc>
-      </w:tr>
-      <w:tr>
-        <w:trPr>
-          <w:cantSplit/>
-          <w:trHeight w:val="520"/>
-        </w:trPr>
-        <w:tc>
-          <w:tcPr>
-            <w:tcW w:w="3200" w:type="dxa"/>
-            <w:tcMar>
-              <w:top w:w="60" w:type="dxa"/>
-              <w:left w:w="100" w:type="dxa"/>
-              <w:bottom w:w="60" w:type="dxa"/>
-              <w:right w:w="100" w:type="dxa"/>
-            </w:tcMar>
-          </w:tcPr>
-          <w:p>
-            <w:pPr>
-              <w:spacing w:line="264" w:lineRule="auto"/>
-            </w:pPr>
-            <w:r>
-              <w:rPr>
-                <w:sz w:val="19"/>
-                <w:szCs w:val="19"/>
-              </w:rPr>
-              <w:t xml:space="preserve">Just after the light turns GREEN</w:t>
-            </w:r>
-          </w:p>
-        </w:tc>
-        <w:tc>
-          <w:tcPr>
-            <w:tcW w:w="3200" w:type="dxa"/>
-            <w:tcMar>
-              <w:top w:w="60" w:type="dxa"/>
-              <w:left w:w="100" w:type="dxa"/>
-              <w:bottom w:w="60" w:type="dxa"/>
-              <w:right w:w="100" w:type="dxa"/>
-            </w:tcMar>
-          </w:tcPr>
-          <w:p>
-            <w:pPr>
-              <w:spacing w:line="264" w:lineRule="auto"/>
-            </w:pPr>
-          </w:p>
-        </w:tc>
-        <w:tc>
-          <w:tcPr>
-            <w:tcW w:w="3306" w:type="dxa"/>
-            <w:tcMar>
-              <w:top w:w="60" w:type="dxa"/>
-              <w:left w:w="100" w:type="dxa"/>
-              <w:bottom w:w="60" w:type="dxa"/>
-              <w:right w:w="100" w:type="dxa"/>
-            </w:tcMar>
-          </w:tcPr>
-          <w:p>
-            <w:pPr>
-              <w:spacing w:line="264" w:lineRule="auto"/>
-            </w:pPr>
-          </w:p>
-        </w:tc>
-      </w:tr>
-      <w:tr>
-        <w:trPr>
-          <w:cantSplit/>
-          <w:trHeight w:val="520"/>
-        </w:trPr>
-        <w:tc>
-          <w:tcPr>
-            <w:tcW w:w="3200" w:type="dxa"/>
-            <w:shd w:val="clear" w:color="auto" w:fill="F3F7FB"/>
-            <w:tcMar>
-              <w:top w:w="60" w:type="dxa"/>
-              <w:left w:w="100" w:type="dxa"/>
-              <w:bottom w:w="60" w:type="dxa"/>
-              <w:right w:w="100" w:type="dxa"/>
-            </w:tcMar>
-          </w:tcPr>
-          <w:p>
-            <w:pPr>
-              <w:spacing w:line="264" w:lineRule="auto"/>
-            </w:pPr>
-            <w:r>
-              <w:rPr>
-                <w:sz w:val="19"/>
-                <w:szCs w:val="19"/>
-              </w:rPr>
-              <w:t xml:space="preserve">When GREEN has been on for more than 5 s</w:t>
-            </w:r>
-          </w:p>
-        </w:tc>
-        <w:tc>
-          <w:tcPr>
-            <w:tcW w:w="3200" w:type="dxa"/>
-            <w:shd w:val="clear" w:color="auto" w:fill="F3F7FB"/>
-            <w:tcMar>
-              <w:top w:w="60" w:type="dxa"/>
-              <w:left w:w="100" w:type="dxa"/>
-              <w:bottom w:w="60" w:type="dxa"/>
-              <w:right w:w="100" w:type="dxa"/>
-            </w:tcMar>
-          </w:tcPr>
-          <w:p>
-            <w:pPr>
-              <w:spacing w:line="264" w:lineRule="auto"/>
-            </w:pPr>
-          </w:p>
-        </w:tc>
-        <w:tc>
-          <w:tcPr>
-            <w:tcW w:w="3306" w:type="dxa"/>
-            <w:shd w:val="clear" w:color="auto" w:fill="F3F7FB"/>
-            <w:tcMar>
-              <w:top w:w="60" w:type="dxa"/>
-              <w:left w:w="100" w:type="dxa"/>
-              <w:bottom w:w="60" w:type="dxa"/>
-              <w:right w:w="100" w:type="dxa"/>
-            </w:tcMar>
-          </w:tcPr>
-          <w:p>
-            <w:pPr>
-              <w:spacing w:line="264" w:lineRule="auto"/>
-            </w:pPr>
-          </w:p>
-        </w:tc>
-      </w:tr>
-      <w:tr>
-        <w:trPr>
-          <w:cantSplit/>
-          <w:trHeight w:val="520"/>
-        </w:trPr>
-        <w:tc>
-          <w:tcPr>
-            <w:tcW w:w="3200" w:type="dxa"/>
-            <w:tcMar>
-              <w:top w:w="60" w:type="dxa"/>
-              <w:left w:w="100" w:type="dxa"/>
-              <w:bottom w:w="60" w:type="dxa"/>
-              <w:right w:w="100" w:type="dxa"/>
-            </w:tcMar>
-          </w:tcPr>
-          <w:p>
-            <w:pPr>
-              <w:spacing w:line="264" w:lineRule="auto"/>
-            </w:pPr>
-            <w:r>
-              <w:rPr>
-                <w:sz w:val="19"/>
-                <w:szCs w:val="19"/>
-              </w:rPr>
-              <w:t xml:space="preserve">During WALK</w:t>
-            </w:r>
-          </w:p>
-        </w:tc>
-        <w:tc>
-          <w:tcPr>
-            <w:tcW w:w="3200" w:type="dxa"/>
-            <w:tcMar>
-              <w:top w:w="60" w:type="dxa"/>
-              <w:left w:w="100" w:type="dxa"/>
-              <w:bottom w:w="60" w:type="dxa"/>
-              <w:right w:w="100" w:type="dxa"/>
-            </w:tcMar>
-          </w:tcPr>
-          <w:p>
-            <w:pPr>
-              <w:spacing w:line="264" w:lineRule="auto"/>
-            </w:pPr>
-          </w:p>
-        </w:tc>
-        <w:tc>
-          <w:tcPr>
-            <w:tcW w:w="3306" w:type="dxa"/>
-            <w:tcMar>
-              <w:top w:w="60" w:type="dxa"/>
-              <w:left w:w="100" w:type="dxa"/>
-              <w:bottom w:w="60" w:type="dxa"/>
-              <w:right w:w="100" w:type="dxa"/>
-            </w:tcMar>
-          </w:tcPr>
-          <w:p>
-            <w:pPr>
-              <w:spacing w:line="264" w:lineRule="auto"/>
-            </w:pPr>
-          </w:p>
-        </w:tc>
-      </w:tr>
-      <w:tr>
-        <w:trPr>
-          <w:cantSplit/>
-          <w:trHeight w:val="520"/>
-        </w:trPr>
-        <w:tc>
-          <w:tcPr>
-            <w:tcW w:w="3200" w:type="dxa"/>
-            <w:shd w:val="clear" w:color="auto" w:fill="F3F7FB"/>
-            <w:tcMar>
-              <w:top w:w="60" w:type="dxa"/>
-              <w:left w:w="100" w:type="dxa"/>
-              <w:bottom w:w="60" w:type="dxa"/>
-              <w:right w:w="100" w:type="dxa"/>
-            </w:tcMar>
-          </w:tcPr>
-          <w:p>
-            <w:pPr>
-              <w:spacing w:line="264" w:lineRule="auto"/>
-            </w:pPr>
-            <w:r>
-              <w:rPr>
-                <w:sz w:val="19"/>
-                <w:szCs w:val="19"/>
-              </w:rPr>
-              <w:t xml:space="preserve">During CLEAR</w:t>
-            </w:r>
-          </w:p>
-        </w:tc>
-        <w:tc>
-          <w:tcPr>
-            <w:tcW w:w="3200" w:type="dxa"/>
-            <w:shd w:val="clear" w:color="auto" w:fill="F3F7FB"/>
-            <w:tcMar>
-              <w:top w:w="60" w:type="dxa"/>
-              <w:left w:w="100" w:type="dxa"/>
-              <w:bottom w:w="60" w:type="dxa"/>
-              <w:right w:w="100" w:type="dxa"/>
-            </w:tcMar>
-          </w:tcPr>
-          <w:p>
-            <w:pPr>
-              <w:spacing w:line="264" w:lineRule="auto"/>
-            </w:pPr>
-          </w:p>
-        </w:tc>
-        <w:tc>
-          <w:tcPr>
-            <w:tcW w:w="3306" w:type="dxa"/>
-            <w:shd w:val="clear" w:color="auto" w:fill="F3F7FB"/>
-            <w:tcMar>
-              <w:top w:w="60" w:type="dxa"/>
-              <w:left w:w="100" w:type="dxa"/>
-              <w:bottom w:w="60" w:type="dxa"/>
-              <w:right w:w="100" w:type="dxa"/>
-            </w:tcMar>
-          </w:tcPr>
-          <w:p>
-            <w:pPr>
-              <w:spacing w:line="264" w:lineRule="auto"/>
-            </w:pPr>
-          </w:p>
-        </w:tc>
-      </w:tr>
-    </w:tbl>
-    <w:p>
-      <w:pPr>
-        <w:spacing w:after="84"/>
-        <w:rPr>
-          <w:sz w:val="8"/>
-        </w:rPr>
-      </w:pPr>
-    </w:p>
-    <w:p>
-      <w:pPr>
-        <w:pStyle w:val="Heading3"/>
-        <w:keepNext/>
-        <w:spacing w:before="180" w:after="60"/>
-      </w:pPr>
-      <w:r>
-        <w:rPr>
-          <w:b/>
-          <w:bCs/>
-        </w:rPr>
-        <w:t xml:space="preserve">3c  delay() would miss it</w:t>
-      </w:r>
-    </w:p>
-    <w:p>
-      <w:pPr>
-        <w:spacing w:after="120" w:line="264" w:lineRule="auto"/>
-      </w:pPr>
-      <w:r>
-        <w:rPr/>
-        <w:t xml:space="preserve">If Task 2 checked the button at the top of </w:t>
-      </w:r>
-      <w:r>
-        <w:rPr>
-          <w:rFonts w:ascii="Consolas" w:hAnsi="Consolas" w:cs="Consolas"/>
-          <w:color w:val="C7254E"/>
-          <w:sz w:val="20"/>
-          <w:szCs w:val="20"/>
-          <w:shd w:val="clear" w:color="auto" w:fill="F4F4F4"/>
-        </w:rPr>
-        <w:t xml:space="preserve">loop()</w:t>
-      </w:r>
-      <w:r>
-        <w:rPr/>
-        <w:t xml:space="preserve">, what is the longest a pedestrian might have to hold it before the board noticed? Why does Task 3 notice a tap of a few milliseconds?</w:t>
+        <w:t xml:space="preserve">Press the button during RED, during GREEN and during YELLOW. What happens each time, and why?</w:t>
       </w:r>
     </w:p>
     <w:tbl>
@@ -5241,16 +4646,16 @@
           <w:b/>
           <w:bCs/>
         </w:rPr>
-        <w:t xml:space="preserve">3d  Rising edge and debouncing</w:t>
-      </w:r>
-    </w:p>
-    <w:p>
-      <w:pPr>
-        <w:spacing w:after="60" w:line="264" w:lineRule="auto"/>
+        <w:t xml:space="preserve">3c  Waiting in a state</w:t>
+      </w:r>
+    </w:p>
+    <w:p>
+      <w:pPr>
+        <w:spacing w:after="120" w:line="264" w:lineRule="auto"/>
       </w:pPr>
       <w:r>
         <w:rPr/>
-        <w:t xml:space="preserve">1. Press the button and keep holding it. When does </w:t>
+        <w:t xml:space="preserve">In </w:t>
       </w:r>
       <w:r>
         <w:rPr>
@@ -5260,20 +4665,11 @@
           <w:szCs w:val="20"/>
           <w:shd w:val="clear" w:color="auto" w:fill="F4F4F4"/>
         </w:rPr>
-        <w:t xml:space="preserve">WAIT...</w:t>
+        <w:t xml:space="preserve">case GREEN:</w:t>
       </w:r>
       <w:r>
         <w:rPr/>
-        <w:t xml:space="preserve"> appear: when you press, or when you let go? Which edge of the D2 signal (rising or falling) is the sketch reacting to?</w:t>
-      </w:r>
-    </w:p>
-    <w:p>
-      <w:pPr>
-        <w:spacing w:after="60" w:line="264" w:lineRule="auto"/>
-      </w:pPr>
-      <w:r>
-        <w:rPr/>
-        <w:t xml:space="preserve">2. In </w:t>
+        <w:t xml:space="preserve"> the </w:t>
       </w:r>
       <w:r>
         <w:rPr>
@@ -5283,62 +4679,11 @@
           <w:szCs w:val="20"/>
           <w:shd w:val="clear" w:color="auto" w:fill="F4F4F4"/>
         </w:rPr>
-        <w:t xml:space="preserve">buttonReleased()</w:t>
+        <w:t xml:space="preserve">while</w:t>
       </w:r>
       <w:r>
         <w:rPr/>
-        <w:t xml:space="preserve">, a new reading only counts once it has stayed the same for </w:t>
-      </w:r>
-      <w:r>
-        <w:rPr>
-          <w:rFonts w:ascii="Consolas" w:hAnsi="Consolas" w:cs="Consolas"/>
-          <w:color w:val="C7254E"/>
-          <w:sz w:val="20"/>
-          <w:szCs w:val="20"/>
-          <w:shd w:val="clear" w:color="auto" w:fill="F4F4F4"/>
-        </w:rPr>
-        <w:t xml:space="preserve">DEBOUNCE_TIME</w:t>
-      </w:r>
-      <w:r>
-        <w:rPr/>
-        <w:t xml:space="preserve"> (50 ms). Why is this needed for a mechanical button?</w:t>
-      </w:r>
-    </w:p>
-    <w:p>
-      <w:pPr>
-        <w:spacing w:after="60" w:line="264" w:lineRule="auto"/>
-      </w:pPr>
-      <w:r>
-        <w:rPr/>
-        <w:t xml:space="preserve">3. Set </w:t>
-      </w:r>
-      <w:r>
-        <w:rPr>
-          <w:rFonts w:ascii="Consolas" w:hAnsi="Consolas" w:cs="Consolas"/>
-          <w:color w:val="C7254E"/>
-          <w:sz w:val="20"/>
-          <w:szCs w:val="20"/>
-          <w:shd w:val="clear" w:color="auto" w:fill="F4F4F4"/>
-        </w:rPr>
-        <w:t xml:space="preserve">DEBOUNCE_TIME</w:t>
-      </w:r>
-      <w:r>
-        <w:rPr/>
-        <w:t xml:space="preserve"> to </w:t>
-      </w:r>
-      <w:r>
-        <w:rPr>
-          <w:rFonts w:ascii="Consolas" w:hAnsi="Consolas" w:cs="Consolas"/>
-          <w:color w:val="C7254E"/>
-          <w:sz w:val="20"/>
-          <w:szCs w:val="20"/>
-          <w:shd w:val="clear" w:color="auto" w:fill="F4F4F4"/>
-        </w:rPr>
-        <w:t xml:space="preserve">0</w:t>
-      </w:r>
-      <w:r>
-        <w:rPr/>
-        <w:t xml:space="preserve"> and press the button several times. Does anything change? Would it matter if the button started a different action on every press, such as counting pedestrians?</w:t>
+        <w:t xml:space="preserve"> loop waits for the button. Could the board flash an LED or check a second button while it waits there? Why not?</w:t>
       </w:r>
     </w:p>
     <w:tbl>

</xml_diff>